<commit_message>
Added evidence for my Pull Request for PM04 Project
</commit_message>
<xml_diff>
--- a/PM-04/pm04-final-project/evidence/PullRequestValidation.docx
+++ b/PM-04/pm04-final-project/evidence/PullRequestValidation.docx
@@ -1,6 +1,6 @@
 
 <file path=word/document.xml><?xml version="1.0" encoding="utf-8"?>
-<w:document xmlns:wpc="http://schemas.microsoft.com/office/word/2010/wordprocessingCanvas" xmlns:cx="http://schemas.microsoft.com/office/drawing/2014/chartex" xmlns:cx1="http://schemas.microsoft.com/office/drawing/2015/9/8/chartex" xmlns:cx2="http://schemas.microsoft.com/office/drawing/2015/10/21/chartex" xmlns:cx3="http://schemas.microsoft.com/office/drawing/2016/5/9/chartex" xmlns:cx4="http://schemas.microsoft.com/office/drawing/2016/5/10/chartex" xmlns:cx5="http://schemas.microsoft.com/office/drawing/2016/5/11/chartex" xmlns:cx6="http://schemas.microsoft.com/office/drawing/2016/5/12/chartex" xmlns:cx7="http://schemas.microsoft.com/office/drawing/2016/5/13/chartex" xmlns:cx8="http://schemas.microsoft.com/office/drawing/2016/5/14/chartex" xmlns:mc="http://schemas.openxmlformats.org/markup-compatibility/2006" xmlns:aink="http://schemas.microsoft.com/office/drawing/2016/ink" xmlns:am3d="http://schemas.microsoft.com/office/drawing/2017/model3d" xmlns:o="urn:schemas-microsoft-com:office:office" xmlns:oel="http://schemas.microsoft.com/office/2019/extlst" xmlns:r="http://schemas.openxmlformats.org/officeDocument/2006/relationships" xmlns:m="http://schemas.openxmlformats.org/officeDocument/2006/math" xmlns:v="urn:schemas-microsoft-com:vml" xmlns:wp14="http://schemas.microsoft.com/office/word/2010/wordprocessingDrawing" xmlns:wp="http://schemas.openxmlformats.org/drawingml/2006/wordprocessingDrawing" xmlns:w10="urn:schemas-microsoft-com:office:word" xmlns:w="http://schemas.openxmlformats.org/wordprocessingml/2006/main" xmlns:w14="http://schemas.microsoft.com/office/word/2010/wordml" xmlns:w15="http://schemas.microsoft.com/office/word/2012/wordml" xmlns:w16cei="http://schemas.microsoft.com/office/word/2026/wordml/cei" xmlns:w16cex="http://schemas.microsoft.com/office/word/2018/wordml/cex" xmlns:w16cid="http://schemas.microsoft.com/office/word/2016/wordml/cid" xmlns:w16="http://schemas.microsoft.com/office/word/2018/wordml" xmlns:w16du="http://schemas.microsoft.com/office/word/2023/wordml/word16du" xmlns:w16sdtdh="http://schemas.microsoft.com/office/word/2020/wordml/sdtdatahash" xmlns:w16sdtfl="http://schemas.microsoft.com/office/word/2024/wordml/sdtformatlock" xmlns:w16se="http://schemas.microsoft.com/office/word/2015/wordml/symex" xmlns:wpg="http://schemas.microsoft.com/office/word/2010/wordprocessingGroup" xmlns:wpi="http://schemas.microsoft.com/office/word/2010/wordprocessingInk" xmlns:wne="http://schemas.microsoft.com/office/word/2006/wordml" xmlns:wps="http://schemas.microsoft.com/office/word/2010/wordprocessingShape" mc:Ignorable="w14 w15 w16se w16cid w16 w16cex w16sdtdh w16sdtfl w16du wp14">
+<w:document xmlns:wpc="http://schemas.microsoft.com/office/word/2010/wordprocessingCanvas" xmlns:cx="http://schemas.microsoft.com/office/drawing/2014/chartex" xmlns:cx1="http://schemas.microsoft.com/office/drawing/2015/9/8/chartex" xmlns:cx2="http://schemas.microsoft.com/office/drawing/2015/10/21/chartex" xmlns:cx3="http://schemas.microsoft.com/office/drawing/2016/5/9/chartex" xmlns:cx4="http://schemas.microsoft.com/office/drawing/2016/5/10/chartex" xmlns:cx5="http://schemas.microsoft.com/office/drawing/2016/5/11/chartex" xmlns:cx6="http://schemas.microsoft.com/office/drawing/2016/5/12/chartex" xmlns:cx7="http://schemas.microsoft.com/office/drawing/2016/5/13/chartex" xmlns:cx8="http://schemas.microsoft.com/office/drawing/2016/5/14/chartex" xmlns:mc="http://schemas.openxmlformats.org/markup-compatibility/2006" xmlns:aink="http://schemas.microsoft.com/office/drawing/2016/ink" xmlns:am3d="http://schemas.microsoft.com/office/drawing/2017/model3d" xmlns:o="urn:schemas-microsoft-com:office:office" xmlns:oel="http://schemas.microsoft.com/office/2019/extlst" xmlns:r="http://schemas.openxmlformats.org/officeDocument/2006/relationships" xmlns:m="http://schemas.openxmlformats.org/officeDocument/2006/math" xmlns:v="urn:schemas-microsoft-com:vml" xmlns:wp14="http://schemas.microsoft.com/office/word/2010/wordprocessingDrawing" xmlns:wp="http://schemas.openxmlformats.org/drawingml/2006/wordprocessingDrawing" xmlns:w10="urn:schemas-microsoft-com:office:word" xmlns:w="http://schemas.openxmlformats.org/wordprocessingml/2006/main" xmlns:w14="http://schemas.microsoft.com/office/word/2010/wordml" xmlns:w15="http://schemas.microsoft.com/office/word/2012/wordml" xmlns:w16cex="http://schemas.microsoft.com/office/word/2018/wordml/cex" xmlns:w16cid="http://schemas.microsoft.com/office/word/2016/wordml/cid" xmlns:w16="http://schemas.microsoft.com/office/word/2018/wordml" xmlns:w16du="http://schemas.microsoft.com/office/word/2023/wordml/word16du" xmlns:w16sdtdh="http://schemas.microsoft.com/office/word/2020/wordml/sdtdatahash" xmlns:w16sdtfl="http://schemas.microsoft.com/office/word/2024/wordml/sdtformatlock" xmlns:w16se="http://schemas.microsoft.com/office/word/2015/wordml/symex" xmlns:wpg="http://schemas.microsoft.com/office/word/2010/wordprocessingGroup" xmlns:wpi="http://schemas.microsoft.com/office/word/2010/wordprocessingInk" xmlns:wne="http://schemas.microsoft.com/office/word/2006/wordml" xmlns:wps="http://schemas.microsoft.com/office/word/2010/wordprocessingShape" mc:Ignorable="w14 w15 w16se w16cid w16 w16cex w16sdtdh w16sdtfl w16du wp14">
   <w:body>
     <w:p>
       <w:pPr>
@@ -245,6 +245,107 @@
                     <a:xfrm>
                       <a:off x="0" y="0"/>
                       <a:ext cx="5731510" cy="3568065"/>
+                    </a:xfrm>
+                    <a:prstGeom prst="rect">
+                      <a:avLst/>
+                    </a:prstGeom>
+                  </pic:spPr>
+                </pic:pic>
+              </a:graphicData>
+            </a:graphic>
+          </wp:inline>
+        </w:drawing>
+      </w:r>
+    </w:p>
+    <w:p>
+      <w:pPr>
+        <w:pStyle w:val="Heading4"/>
+      </w:pPr>
+      <w:r>
+        <w:t>Ryan Ward Changes</w:t>
+      </w:r>
+      <w:r>
+        <w:t xml:space="preserve"> 2026/10/18</w:t>
+      </w:r>
+    </w:p>
+    <w:p>
+      <w:r>
+        <w:t>My pull request</w:t>
+      </w:r>
+    </w:p>
+    <w:p>
+      <w:r>
+        <w:rPr>
+          <w:noProof/>
+        </w:rPr>
+        <w:drawing>
+          <wp:inline distT="0" distB="0" distL="0" distR="0" wp14:anchorId="5E50E84F" wp14:editId="5D7CC446">
+            <wp:extent cx="5731510" cy="3552190"/>
+            <wp:effectExtent l="0" t="0" r="2540" b="0"/>
+            <wp:docPr id="1423748182" name="Picture 1" descr="The image displays a GitHub pull request page, showcasing a comparison between the 'main' and 'RWPM04' branches, with added changes, assigned to 'BrandonDeWet', and updates to 'README.md', 'style.css', and 'script.js'.&#10;&#10;AI-generated content may be incorrect."/>
+            <wp:cNvGraphicFramePr>
+              <a:graphicFrameLocks xmlns:a="http://schemas.openxmlformats.org/drawingml/2006/main" noChangeAspect="1"/>
+            </wp:cNvGraphicFramePr>
+            <a:graphic xmlns:a="http://schemas.openxmlformats.org/drawingml/2006/main">
+              <a:graphicData uri="http://schemas.openxmlformats.org/drawingml/2006/picture">
+                <pic:pic xmlns:pic="http://schemas.openxmlformats.org/drawingml/2006/picture">
+                  <pic:nvPicPr>
+                    <pic:cNvPr id="1423748182" name="Picture 1" descr="The image displays a GitHub pull request page, showcasing a comparison between the 'main' and 'RWPM04' branches, with added changes, assigned to 'BrandonDeWet', and updates to 'README.md', 'style.css', and 'script.js'.&#10;&#10;AI-generated content may be incorrect."/>
+                    <pic:cNvPicPr/>
+                  </pic:nvPicPr>
+                  <pic:blipFill>
+                    <a:blip r:embed="rId10"/>
+                    <a:stretch>
+                      <a:fillRect/>
+                    </a:stretch>
+                  </pic:blipFill>
+                  <pic:spPr>
+                    <a:xfrm>
+                      <a:off x="0" y="0"/>
+                      <a:ext cx="5731510" cy="3552190"/>
+                    </a:xfrm>
+                    <a:prstGeom prst="rect">
+                      <a:avLst/>
+                    </a:prstGeom>
+                  </pic:spPr>
+                </pic:pic>
+              </a:graphicData>
+            </a:graphic>
+          </wp:inline>
+        </w:drawing>
+      </w:r>
+    </w:p>
+    <w:p>
+      <w:r>
+        <w:rPr>
+          <w:noProof/>
+        </w:rPr>
+        <w:lastRenderedPageBreak/>
+        <w:drawing>
+          <wp:inline distT="0" distB="0" distL="0" distR="0" wp14:anchorId="10C01F36" wp14:editId="59896DE5">
+            <wp:extent cx="5731510" cy="3760470"/>
+            <wp:effectExtent l="0" t="0" r="2540" b="0"/>
+            <wp:docPr id="1594820159" name="Picture 1" descr="The image shows a user interface for a project management software, specifically a GitHub pull request page, with various fields for updating and documenting changes to a README file.&#10;&#10;AI-generated content may be incorrect."/>
+            <wp:cNvGraphicFramePr>
+              <a:graphicFrameLocks xmlns:a="http://schemas.openxmlformats.org/drawingml/2006/main" noChangeAspect="1"/>
+            </wp:cNvGraphicFramePr>
+            <a:graphic xmlns:a="http://schemas.openxmlformats.org/drawingml/2006/main">
+              <a:graphicData uri="http://schemas.openxmlformats.org/drawingml/2006/picture">
+                <pic:pic xmlns:pic="http://schemas.openxmlformats.org/drawingml/2006/picture">
+                  <pic:nvPicPr>
+                    <pic:cNvPr id="1594820159" name="Picture 1" descr="The image shows a user interface for a project management software, specifically a GitHub pull request page, with various fields for updating and documenting changes to a README file.&#10;&#10;AI-generated content may be incorrect."/>
+                    <pic:cNvPicPr/>
+                  </pic:nvPicPr>
+                  <pic:blipFill>
+                    <a:blip r:embed="rId11"/>
+                    <a:stretch>
+                      <a:fillRect/>
+                    </a:stretch>
+                  </pic:blipFill>
+                  <pic:spPr>
+                    <a:xfrm>
+                      <a:off x="0" y="0"/>
+                      <a:ext cx="5731510" cy="3760470"/>
                     </a:xfrm>
                     <a:prstGeom prst="rect">
                       <a:avLst/>
@@ -695,7 +796,6 @@
     <w:next w:val="Normal"/>
     <w:link w:val="Heading2Char"/>
     <w:uiPriority w:val="9"/>
-    <w:semiHidden/>
     <w:unhideWhenUsed/>
     <w:qFormat/>
     <w:rsid w:val="007011DD"/>
@@ -718,7 +818,6 @@
     <w:next w:val="Normal"/>
     <w:link w:val="Heading3Char"/>
     <w:uiPriority w:val="9"/>
-    <w:semiHidden/>
     <w:unhideWhenUsed/>
     <w:qFormat/>
     <w:rsid w:val="007011DD"/>
@@ -741,7 +840,6 @@
     <w:next w:val="Normal"/>
     <w:link w:val="Heading4Char"/>
     <w:uiPriority w:val="9"/>
-    <w:semiHidden/>
     <w:unhideWhenUsed/>
     <w:qFormat/>
     <w:rsid w:val="007011DD"/>
@@ -912,7 +1010,6 @@
     <w:basedOn w:val="DefaultParagraphFont"/>
     <w:link w:val="Heading2"/>
     <w:uiPriority w:val="9"/>
-    <w:semiHidden/>
     <w:rsid w:val="007011DD"/>
     <w:rPr>
       <w:rFonts w:asciiTheme="majorHAnsi" w:eastAsiaTheme="majorEastAsia" w:hAnsiTheme="majorHAnsi" w:cstheme="majorBidi"/>
@@ -926,7 +1023,6 @@
     <w:basedOn w:val="DefaultParagraphFont"/>
     <w:link w:val="Heading3"/>
     <w:uiPriority w:val="9"/>
-    <w:semiHidden/>
     <w:rsid w:val="007011DD"/>
     <w:rPr>
       <w:rFonts w:eastAsiaTheme="majorEastAsia" w:cstheme="majorBidi"/>
@@ -940,7 +1036,6 @@
     <w:basedOn w:val="DefaultParagraphFont"/>
     <w:link w:val="Heading4"/>
     <w:uiPriority w:val="9"/>
-    <w:semiHidden/>
     <w:rsid w:val="007011DD"/>
     <w:rPr>
       <w:rFonts w:eastAsiaTheme="majorEastAsia" w:cstheme="majorBidi"/>

</xml_diff>